<commit_message>
Auto-save: 2 file(s) — 2026-10-22 11:27
</commit_message>
<xml_diff>
--- a/Notes/2026-10-21-xloop-linkedin-data-ai-travel-posts-v2.docx
+++ b/Notes/2026-10-21-xloop-linkedin-data-ai-travel-posts-v2.docx
@@ -55,8 +55,6 @@
       <w:pPr>
         <w:pStyle w:val="Title"/>
       </w:pPr>
-      <w:bookmarkStart w:id="0" w:name="_GoBack"/>
-      <w:bookmarkEnd w:id="0"/>
       <w:r>
         <w:rPr>
           <w:b/>
@@ -145,8 +143,28 @@
                 <w:sz w:val="20"/>
                 <w:szCs w:val="20"/>
               </w:rPr>
-              <w:t>S</w:t>
-            </w:r>
+              <w:t>Slide</w:t>
+            </w:r>
+          </w:p>
+        </w:tc>
+        <w:tc>
+          <w:tcPr>
+            <w:tcW w:w="0" w:type="auto"/>
+            <w:tcBorders>
+              <w:top w:val="single" w:sz="4" w:space="0" w:color="BFBFBF"/>
+              <w:left w:val="single" w:sz="4" w:space="0" w:color="BFBFBF"/>
+              <w:bottom w:val="single" w:sz="4" w:space="0" w:color="BFBFBF"/>
+              <w:right w:val="single" w:sz="4" w:space="0" w:color="BFBFBF"/>
+            </w:tcBorders>
+            <w:shd w:val="clear" w:color="auto" w:fill="1F4E79"/>
+            <w:tcMar>
+              <w:top w:w="60" w:type="dxa"/>
+              <w:left w:w="100" w:type="dxa"/>
+              <w:bottom w:w="60" w:type="dxa"/>
+              <w:right w:w="100" w:type="dxa"/>
+            </w:tcMar>
+          </w:tcPr>
+          <w:p>
             <w:r>
               <w:rPr>
                 <w:b/>
@@ -155,20 +173,104 @@
                 <w:sz w:val="20"/>
                 <w:szCs w:val="20"/>
               </w:rPr>
-              <w:t>lide</w:t>
-            </w:r>
-          </w:p>
-        </w:tc>
-        <w:tc>
-          <w:tcPr>
-            <w:tcW w:w="0" w:type="auto"/>
-            <w:tcBorders>
-              <w:top w:val="single" w:sz="4" w:space="0" w:color="BFBFBF"/>
-              <w:left w:val="single" w:sz="4" w:space="0" w:color="BFBFBF"/>
-              <w:bottom w:val="single" w:sz="4" w:space="0" w:color="BFBFBF"/>
-              <w:right w:val="single" w:sz="4" w:space="0" w:color="BFBFBF"/>
-            </w:tcBorders>
-            <w:shd w:val="clear" w:color="auto" w:fill="1F4E79"/>
+              <w:t>On-visual text</w:t>
+            </w:r>
+          </w:p>
+        </w:tc>
+      </w:tr>
+      <w:tr>
+        <w:tc>
+          <w:tcPr>
+            <w:tcW w:w="0" w:type="auto"/>
+            <w:tcBorders>
+              <w:top w:val="single" w:sz="4" w:space="0" w:color="BFBFBF"/>
+              <w:left w:val="single" w:sz="4" w:space="0" w:color="BFBFBF"/>
+              <w:bottom w:val="single" w:sz="4" w:space="0" w:color="BFBFBF"/>
+              <w:right w:val="single" w:sz="4" w:space="0" w:color="BFBFBF"/>
+            </w:tcBorders>
+            <w:tcMar>
+              <w:top w:w="60" w:type="dxa"/>
+              <w:left w:w="100" w:type="dxa"/>
+              <w:bottom w:w="60" w:type="dxa"/>
+              <w:right w:w="100" w:type="dxa"/>
+            </w:tcMar>
+          </w:tcPr>
+          <w:p>
+            <w:r>
+              <w:rPr>
+                <w:color w:val="222222"/>
+                <w:sz w:val="20"/>
+                <w:szCs w:val="20"/>
+              </w:rPr>
+              <w:t>1</w:t>
+            </w:r>
+          </w:p>
+        </w:tc>
+        <w:tc>
+          <w:tcPr>
+            <w:tcW w:w="0" w:type="auto"/>
+            <w:tcBorders>
+              <w:top w:val="single" w:sz="4" w:space="0" w:color="BFBFBF"/>
+              <w:left w:val="single" w:sz="4" w:space="0" w:color="BFBFBF"/>
+              <w:bottom w:val="single" w:sz="4" w:space="0" w:color="BFBFBF"/>
+              <w:right w:val="single" w:sz="4" w:space="0" w:color="BFBFBF"/>
+            </w:tcBorders>
+            <w:tcMar>
+              <w:top w:w="60" w:type="dxa"/>
+              <w:left w:w="100" w:type="dxa"/>
+              <w:bottom w:w="60" w:type="dxa"/>
+              <w:right w:w="100" w:type="dxa"/>
+            </w:tcMar>
+          </w:tcPr>
+          <w:p>
+            <w:r>
+              <w:rPr>
+                <w:color w:val="222222"/>
+                <w:sz w:val="20"/>
+                <w:szCs w:val="20"/>
+              </w:rPr>
+              <w:t>Before an AI agent goes live, we check five things.</w:t>
+            </w:r>
+          </w:p>
+        </w:tc>
+      </w:tr>
+      <w:tr>
+        <w:tc>
+          <w:tcPr>
+            <w:tcW w:w="0" w:type="auto"/>
+            <w:tcBorders>
+              <w:top w:val="single" w:sz="4" w:space="0" w:color="BFBFBF"/>
+              <w:left w:val="single" w:sz="4" w:space="0" w:color="BFBFBF"/>
+              <w:bottom w:val="single" w:sz="4" w:space="0" w:color="BFBFBF"/>
+              <w:right w:val="single" w:sz="4" w:space="0" w:color="BFBFBF"/>
+            </w:tcBorders>
+            <w:tcMar>
+              <w:top w:w="60" w:type="dxa"/>
+              <w:left w:w="100" w:type="dxa"/>
+              <w:bottom w:w="60" w:type="dxa"/>
+              <w:right w:w="100" w:type="dxa"/>
+            </w:tcMar>
+          </w:tcPr>
+          <w:p>
+            <w:r>
+              <w:rPr>
+                <w:color w:val="222222"/>
+                <w:sz w:val="20"/>
+                <w:szCs w:val="20"/>
+              </w:rPr>
+              <w:t>2</w:t>
+            </w:r>
+          </w:p>
+        </w:tc>
+        <w:tc>
+          <w:tcPr>
+            <w:tcW w:w="0" w:type="auto"/>
+            <w:tcBorders>
+              <w:top w:val="single" w:sz="4" w:space="0" w:color="BFBFBF"/>
+              <w:left w:val="single" w:sz="4" w:space="0" w:color="BFBFBF"/>
+              <w:bottom w:val="single" w:sz="4" w:space="0" w:color="BFBFBF"/>
+              <w:right w:val="single" w:sz="4" w:space="0" w:color="BFBFBF"/>
+            </w:tcBorders>
             <w:tcMar>
               <w:top w:w="60" w:type="dxa"/>
               <w:left w:w="100" w:type="dxa"/>
@@ -181,11 +283,19 @@
               <w:rPr>
                 <w:b/>
                 <w:bCs/>
-                <w:color w:val="FFFFFF"/>
-                <w:sz w:val="20"/>
-                <w:szCs w:val="20"/>
-              </w:rPr>
-              <w:t>On-visual text</w:t>
+                <w:color w:val="222222"/>
+                <w:sz w:val="20"/>
+                <w:szCs w:val="20"/>
+              </w:rPr>
+              <w:t>1. A clear job.</w:t>
+            </w:r>
+            <w:r>
+              <w:rPr>
+                <w:color w:val="222222"/>
+                <w:sz w:val="20"/>
+                <w:szCs w:val="20"/>
+              </w:rPr>
+              <w:t xml:space="preserve"> With a person who owns the outcome.</w:t>
             </w:r>
           </w:p>
         </w:tc>
@@ -214,34 +324,36 @@
                 <w:sz w:val="20"/>
                 <w:szCs w:val="20"/>
               </w:rPr>
-              <w:t>1</w:t>
-            </w:r>
-          </w:p>
-        </w:tc>
-        <w:tc>
-          <w:tcPr>
-            <w:tcW w:w="0" w:type="auto"/>
-            <w:tcBorders>
-              <w:top w:val="single" w:sz="4" w:space="0" w:color="BFBFBF"/>
-              <w:left w:val="single" w:sz="4" w:space="0" w:color="BFBFBF"/>
-              <w:bottom w:val="single" w:sz="4" w:space="0" w:color="BFBFBF"/>
-              <w:right w:val="single" w:sz="4" w:space="0" w:color="BFBFBF"/>
-            </w:tcBorders>
-            <w:tcMar>
-              <w:top w:w="60" w:type="dxa"/>
-              <w:left w:w="100" w:type="dxa"/>
-              <w:bottom w:w="60" w:type="dxa"/>
-              <w:right w:w="100" w:type="dxa"/>
-            </w:tcMar>
-          </w:tcPr>
-          <w:p>
-            <w:r>
-              <w:rPr>
-                <w:color w:val="222222"/>
-                <w:sz w:val="20"/>
-                <w:szCs w:val="20"/>
-              </w:rPr>
-              <w:t>Before an AI agent goes live, we check five things.</w:t>
+              <w:t>3</w:t>
+            </w:r>
+          </w:p>
+        </w:tc>
+        <w:tc>
+          <w:tcPr>
+            <w:tcW w:w="0" w:type="auto"/>
+            <w:tcBorders>
+              <w:top w:val="single" w:sz="4" w:space="0" w:color="BFBFBF"/>
+              <w:left w:val="single" w:sz="4" w:space="0" w:color="BFBFBF"/>
+              <w:bottom w:val="single" w:sz="4" w:space="0" w:color="BFBFBF"/>
+              <w:right w:val="single" w:sz="4" w:space="0" w:color="BFBFBF"/>
+            </w:tcBorders>
+            <w:tcMar>
+              <w:top w:w="60" w:type="dxa"/>
+              <w:left w:w="100" w:type="dxa"/>
+              <w:bottom w:w="60" w:type="dxa"/>
+              <w:right w:w="100" w:type="dxa"/>
+            </w:tcMar>
+          </w:tcPr>
+          <w:p>
+            <w:r>
+              <w:rPr>
+                <w:b/>
+                <w:bCs/>
+                <w:color w:val="222222"/>
+                <w:sz w:val="20"/>
+                <w:szCs w:val="20"/>
+              </w:rPr>
+              <w:t>2. Data the agent can trust.</w:t>
             </w:r>
           </w:p>
         </w:tc>
@@ -270,7 +382,7 @@
                 <w:sz w:val="20"/>
                 <w:szCs w:val="20"/>
               </w:rPr>
-              <w:t>2</w:t>
+              <w:t>4</w:t>
             </w:r>
           </w:p>
         </w:tc>
@@ -299,15 +411,39 @@
                 <w:sz w:val="20"/>
                 <w:szCs w:val="20"/>
               </w:rPr>
-              <w:t>1. A clear job.</w:t>
-            </w:r>
-            <w:r>
-              <w:rPr>
-                <w:color w:val="222222"/>
-                <w:sz w:val="20"/>
-                <w:szCs w:val="20"/>
-              </w:rPr>
-              <w:t xml:space="preserve"> With a person who owns the outcome.</w:t>
+              <w:t xml:space="preserve">3. </w:t>
+            </w:r>
+            <w:r>
+              <w:rPr>
+                <w:b/>
+                <w:bCs/>
+                <w:color w:val="222222"/>
+                <w:sz w:val="20"/>
+                <w:szCs w:val="20"/>
+              </w:rPr>
+              <w:t xml:space="preserve">Scoped </w:t>
+            </w:r>
+            <w:r>
+              <w:rPr>
+                <w:b/>
+                <w:bCs/>
+                <w:color w:val="222222"/>
+                <w:sz w:val="20"/>
+                <w:szCs w:val="20"/>
+              </w:rPr>
+              <w:t>P</w:t>
+            </w:r>
+            <w:bookmarkStart w:id="0" w:name="_GoBack"/>
+            <w:bookmarkEnd w:id="0"/>
+            <w:r>
+              <w:rPr>
+                <w:b/>
+                <w:bCs/>
+                <w:color w:val="222222"/>
+                <w:sz w:val="20"/>
+                <w:szCs w:val="20"/>
+              </w:rPr>
+              <w:t>ermissions limited to the task.</w:t>
             </w:r>
           </w:p>
         </w:tc>
@@ -336,7 +472,7 @@
                 <w:sz w:val="20"/>
                 <w:szCs w:val="20"/>
               </w:rPr>
-              <w:t>3</w:t>
+              <w:t>5</w:t>
             </w:r>
           </w:p>
         </w:tc>
@@ -365,7 +501,15 @@
                 <w:sz w:val="20"/>
                 <w:szCs w:val="20"/>
               </w:rPr>
-              <w:t>2. Data the agent can trust.</w:t>
+              <w:t>4. A human checkpoint</w:t>
+            </w:r>
+            <w:r>
+              <w:rPr>
+                <w:color w:val="222222"/>
+                <w:sz w:val="20"/>
+                <w:szCs w:val="20"/>
+              </w:rPr>
+              <w:t xml:space="preserve"> for actions that matter.</w:t>
             </w:r>
           </w:p>
         </w:tc>
@@ -394,7 +538,7 @@
                 <w:sz w:val="20"/>
                 <w:szCs w:val="20"/>
               </w:rPr>
-              <w:t>4</w:t>
+              <w:t>6</w:t>
             </w:r>
           </w:p>
         </w:tc>
@@ -423,56 +567,8 @@
                 <w:sz w:val="20"/>
                 <w:szCs w:val="20"/>
               </w:rPr>
-              <w:t>3. Permissions limited to the task.</w:t>
-            </w:r>
-          </w:p>
-        </w:tc>
-      </w:tr>
-      <w:tr>
-        <w:tc>
-          <w:tcPr>
-            <w:tcW w:w="0" w:type="auto"/>
-            <w:tcBorders>
-              <w:top w:val="single" w:sz="4" w:space="0" w:color="BFBFBF"/>
-              <w:left w:val="single" w:sz="4" w:space="0" w:color="BFBFBF"/>
-              <w:bottom w:val="single" w:sz="4" w:space="0" w:color="BFBFBF"/>
-              <w:right w:val="single" w:sz="4" w:space="0" w:color="BFBFBF"/>
-            </w:tcBorders>
-            <w:tcMar>
-              <w:top w:w="60" w:type="dxa"/>
-              <w:left w:w="100" w:type="dxa"/>
-              <w:bottom w:w="60" w:type="dxa"/>
-              <w:right w:w="100" w:type="dxa"/>
-            </w:tcMar>
-          </w:tcPr>
-          <w:p>
-            <w:r>
-              <w:rPr>
-                <w:color w:val="222222"/>
-                <w:sz w:val="20"/>
-                <w:szCs w:val="20"/>
-              </w:rPr>
-              <w:t>5</w:t>
-            </w:r>
-          </w:p>
-        </w:tc>
-        <w:tc>
-          <w:tcPr>
-            <w:tcW w:w="0" w:type="auto"/>
-            <w:tcBorders>
-              <w:top w:val="single" w:sz="4" w:space="0" w:color="BFBFBF"/>
-              <w:left w:val="single" w:sz="4" w:space="0" w:color="BFBFBF"/>
-              <w:bottom w:val="single" w:sz="4" w:space="0" w:color="BFBFBF"/>
-              <w:right w:val="single" w:sz="4" w:space="0" w:color="BFBFBF"/>
-            </w:tcBorders>
-            <w:tcMar>
-              <w:top w:w="60" w:type="dxa"/>
-              <w:left w:w="100" w:type="dxa"/>
-              <w:bottom w:w="60" w:type="dxa"/>
-              <w:right w:w="100" w:type="dxa"/>
-            </w:tcMar>
-          </w:tcPr>
-          <w:p>
+              <w:t xml:space="preserve">5. </w:t>
+            </w:r>
             <w:r>
               <w:rPr>
                 <w:b/>
@@ -481,81 +577,31 @@
                 <w:sz w:val="20"/>
                 <w:szCs w:val="20"/>
               </w:rPr>
-              <w:t>4. A human checkpoint</w:t>
-            </w:r>
-            <w:r>
-              <w:rPr>
-                <w:color w:val="222222"/>
-                <w:sz w:val="20"/>
-                <w:szCs w:val="20"/>
-              </w:rPr>
-              <w:t xml:space="preserve"> for actions that matter.</w:t>
-            </w:r>
-          </w:p>
-        </w:tc>
-      </w:tr>
-      <w:tr>
-        <w:tc>
-          <w:tcPr>
-            <w:tcW w:w="0" w:type="auto"/>
-            <w:tcBorders>
-              <w:top w:val="single" w:sz="4" w:space="0" w:color="BFBFBF"/>
-              <w:left w:val="single" w:sz="4" w:space="0" w:color="BFBFBF"/>
-              <w:bottom w:val="single" w:sz="4" w:space="0" w:color="BFBFBF"/>
-              <w:right w:val="single" w:sz="4" w:space="0" w:color="BFBFBF"/>
-            </w:tcBorders>
-            <w:tcMar>
-              <w:top w:w="60" w:type="dxa"/>
-              <w:left w:w="100" w:type="dxa"/>
-              <w:bottom w:w="60" w:type="dxa"/>
-              <w:right w:w="100" w:type="dxa"/>
-            </w:tcMar>
-          </w:tcPr>
-          <w:p>
-            <w:r>
-              <w:rPr>
-                <w:color w:val="222222"/>
-                <w:sz w:val="20"/>
-                <w:szCs w:val="20"/>
-              </w:rPr>
-              <w:t>6</w:t>
-            </w:r>
-          </w:p>
-        </w:tc>
-        <w:tc>
-          <w:tcPr>
-            <w:tcW w:w="0" w:type="auto"/>
-            <w:tcBorders>
-              <w:top w:val="single" w:sz="4" w:space="0" w:color="BFBFBF"/>
-              <w:left w:val="single" w:sz="4" w:space="0" w:color="BFBFBF"/>
-              <w:bottom w:val="single" w:sz="4" w:space="0" w:color="BFBFBF"/>
-              <w:right w:val="single" w:sz="4" w:space="0" w:color="BFBFBF"/>
-            </w:tcBorders>
-            <w:tcMar>
-              <w:top w:w="60" w:type="dxa"/>
-              <w:left w:w="100" w:type="dxa"/>
-              <w:bottom w:w="60" w:type="dxa"/>
-              <w:right w:w="100" w:type="dxa"/>
-            </w:tcMar>
-          </w:tcPr>
-          <w:p>
-            <w:r>
-              <w:rPr>
-                <w:b/>
-                <w:bCs/>
-                <w:color w:val="222222"/>
-                <w:sz w:val="20"/>
-                <w:szCs w:val="20"/>
-              </w:rPr>
-              <w:t>5. Logs</w:t>
-            </w:r>
-            <w:r>
-              <w:rPr>
-                <w:color w:val="222222"/>
-                <w:sz w:val="20"/>
-                <w:szCs w:val="20"/>
-              </w:rPr>
-              <w:t xml:space="preserve"> that show why it did what it did.</w:t>
+              <w:t>Audit trail</w:t>
+            </w:r>
+            <w:r>
+              <w:rPr>
+                <w:color w:val="222222"/>
+                <w:sz w:val="20"/>
+                <w:szCs w:val="20"/>
+              </w:rPr>
+              <w:t xml:space="preserve"> that show</w:t>
+            </w:r>
+            <w:r>
+              <w:rPr>
+                <w:color w:val="222222"/>
+                <w:sz w:val="20"/>
+                <w:szCs w:val="20"/>
+              </w:rPr>
+              <w:t>s</w:t>
+            </w:r>
+            <w:r>
+              <w:rPr>
+                <w:color w:val="222222"/>
+                <w:sz w:val="20"/>
+                <w:szCs w:val="20"/>
+              </w:rPr>
+              <w:t xml:space="preserve"> why it did what it did.</w:t>
             </w:r>
           </w:p>
         </w:tc>
@@ -633,6 +679,7 @@
         <w:rPr>
           <w:b/>
           <w:bCs/>
+          <w:noProof/>
           <w:color w:val="1F4E79"/>
           <w:sz w:val="24"/>
           <w:szCs w:val="24"/>
@@ -806,13 +853,7 @@
         <w:rPr>
           <w:color w:val="222222"/>
         </w:rPr>
-        <w:t>Ag</w:t>
-      </w:r>
-      <w:r>
-        <w:rPr>
-          <w:color w:val="222222"/>
-        </w:rPr>
-        <w:t>enticAI</w:t>
+        <w:t>AgenticAI</w:t>
       </w:r>
       <w:proofErr w:type="spellEnd"/>
       <w:r>
@@ -863,17 +904,7 @@
           <w:szCs w:val="30"/>
         </w:rPr>
         <w:lastRenderedPageBreak/>
-        <w:t xml:space="preserve">Post 2 · </w:t>
-      </w:r>
-      <w:r>
-        <w:rPr>
-          <w:b/>
-          <w:bCs/>
-          <w:color w:val="1F4E79"/>
-          <w:sz w:val="30"/>
-          <w:szCs w:val="30"/>
-        </w:rPr>
-        <w:t>Case: HBL Asset Management · Video (~30s)</w:t>
+        <w:t>Post 2 · Case: HBL Asset Management · Video (~30s)</w:t>
       </w:r>
     </w:p>
     <w:p>
@@ -1028,16 +1059,6 @@
           <w:shd w:val="clear" w:color="auto" w:fill="FFFFFF"/>
         </w:rPr>
         <w:br/>
-      </w:r>
-      <w:r>
-        <w:rPr>
-          <w:rStyle w:val="Strong"/>
-          <w:rFonts w:ascii="Segoe UI" w:hAnsi="Segoe UI" w:cs="Segoe UI"/>
-          <w:color w:val="0F1115"/>
-          <w:sz w:val="23"/>
-          <w:szCs w:val="23"/>
-          <w:shd w:val="clear" w:color="auto" w:fill="FFFFFF"/>
-        </w:rPr>
         <w:t>We automated it.</w:t>
       </w:r>
       <w:r>
@@ -1377,13 +1398,7 @@
               <w:rPr>
                 <w:color w:val="222222"/>
               </w:rPr>
-              <w:t>If your oper</w:t>
-            </w:r>
-            <w:r>
-              <w:rPr>
-                <w:color w:val="222222"/>
-              </w:rPr>
-              <w:t>ations team still reconciles by hand, this is where we'd start.</w:t>
+              <w:t>If your operations team still reconciles by hand, this is where we'd start.</w:t>
             </w:r>
           </w:p>
         </w:tc>
@@ -1425,13 +1440,7 @@
         <w:rPr>
           <w:color w:val="222222"/>
         </w:rPr>
-        <w:t xml:space="preserve"> "Automation and AI for banking and asset management</w:t>
-      </w:r>
-      <w:r>
-        <w:rPr>
-          <w:color w:val="222222"/>
-        </w:rPr>
-        <w:t>: https://xloopdigital.com/industries/banking-and-finance"</w:t>
+        <w:t xml:space="preserve"> "Automation and AI for banking and asset management: https://xloopdigital.com/industries/banking-and-finance"</w:t>
       </w:r>
     </w:p>
     <w:p>
@@ -1508,17 +1517,7 @@
           <w:szCs w:val="30"/>
         </w:rPr>
         <w:lastRenderedPageBreak/>
-        <w:t xml:space="preserve">Post 3 · </w:t>
-      </w:r>
-      <w:r>
-        <w:rPr>
-          <w:b/>
-          <w:bCs/>
-          <w:color w:val="1F4E79"/>
-          <w:sz w:val="30"/>
-          <w:szCs w:val="30"/>
-        </w:rPr>
-        <w:t>AI security · Video (~30s)</w:t>
+        <w:t>Post 3 · AI security · Video (~30s)</w:t>
       </w:r>
     </w:p>
     <w:tbl>
@@ -2044,15 +2043,7 @@
                 <w:sz w:val="20"/>
                 <w:szCs w:val="20"/>
               </w:rPr>
-              <w:t>Three s</w:t>
-            </w:r>
-            <w:r>
-              <w:rPr>
-                <w:color w:val="222222"/>
-                <w:sz w:val="20"/>
-                <w:szCs w:val="20"/>
-              </w:rPr>
-              <w:t>ervice tiles</w:t>
+              <w:t>Three service tiles</w:t>
             </w:r>
           </w:p>
         </w:tc>
@@ -2324,17 +2315,7 @@
           <w:szCs w:val="30"/>
         </w:rPr>
         <w:lastRenderedPageBreak/>
-        <w:t xml:space="preserve">Post 4 · </w:t>
-      </w:r>
-      <w:r>
-        <w:rPr>
-          <w:b/>
-          <w:bCs/>
-          <w:color w:val="1F4E79"/>
-          <w:sz w:val="30"/>
-          <w:szCs w:val="30"/>
-        </w:rPr>
-        <w:t>Data foundation · Carousel</w:t>
+        <w:t>Post 4 · Data foundation · Carousel</w:t>
       </w:r>
     </w:p>
     <w:tbl>
@@ -2470,15 +2451,7 @@
                 <w:sz w:val="20"/>
                 <w:szCs w:val="20"/>
               </w:rPr>
-              <w:t>If you asked</w:t>
-            </w:r>
-            <w:r>
-              <w:rPr>
-                <w:color w:val="222222"/>
-                <w:sz w:val="20"/>
-                <w:szCs w:val="20"/>
-              </w:rPr>
-              <w:t xml:space="preserve"> a team why their AI pilot stalled, here’s what they’d tell you…</w:t>
+              <w:t>If you asked a team why their AI pilot stalled, here’s what they’d tell you…</w:t>
             </w:r>
           </w:p>
         </w:tc>
@@ -2805,15 +2778,7 @@
                 <w:sz w:val="20"/>
                 <w:szCs w:val="20"/>
               </w:rPr>
-              <w:t>To solve that, we f</w:t>
-            </w:r>
-            <w:r>
-              <w:rPr>
-                <w:color w:val="222222"/>
-                <w:sz w:val="20"/>
-                <w:szCs w:val="20"/>
-              </w:rPr>
-              <w:t xml:space="preserve">ix the foundation first. </w:t>
+              <w:t xml:space="preserve">To solve that, we fix the foundation first. </w:t>
             </w:r>
           </w:p>
         </w:tc>
@@ -2883,15 +2848,7 @@
                 <w:sz w:val="20"/>
                 <w:szCs w:val="20"/>
               </w:rPr>
-              <w:t>C</w:t>
-            </w:r>
-            <w:r>
-              <w:rPr>
-                <w:color w:val="222222"/>
-                <w:sz w:val="20"/>
-                <w:szCs w:val="20"/>
-              </w:rPr>
-              <w:t>lear ownership, pipelines you can monitor. Then your AI use cases have something solid to stand on.</w:t>
+              <w:t>Clear ownership, pipelines you can monitor. Then your AI use cases have something solid to stand on.</w:t>
             </w:r>
           </w:p>
         </w:tc>
@@ -2955,13 +2912,7 @@
               <w:rPr>
                 <w:color w:val="222222"/>
               </w:rPr>
-              <w:t>Our checklist s</w:t>
-            </w:r>
-            <w:r>
-              <w:rPr>
-                <w:color w:val="222222"/>
-              </w:rPr>
-              <w:t>hows how to tell if your data is ready for AI. Link in the first comment.</w:t>
+              <w:t>Our checklist shows how to tell if your data is ready for AI. Link in the first comment.</w:t>
             </w:r>
           </w:p>
         </w:tc>
@@ -3094,17 +3045,7 @@
           <w:szCs w:val="30"/>
         </w:rPr>
         <w:lastRenderedPageBreak/>
-        <w:t xml:space="preserve">Post 5 · </w:t>
-      </w:r>
-      <w:r>
-        <w:rPr>
-          <w:b/>
-          <w:bCs/>
-          <w:color w:val="1F4E79"/>
-          <w:sz w:val="30"/>
-          <w:szCs w:val="30"/>
-        </w:rPr>
-        <w:t>Case: AWS to Azure migration plan · Carousel</w:t>
+        <w:t>Post 5 · Case: AWS to Azure migration plan · Carousel</w:t>
       </w:r>
     </w:p>
     <w:tbl>
@@ -3690,13 +3631,7 @@
               <w:rPr>
                 <w:color w:val="222222"/>
               </w:rPr>
-              <w:t>A cloud migration fails in planning long before it fails in cutover. Fo</w:t>
-            </w:r>
-            <w:r>
-              <w:rPr>
-                <w:color w:val="222222"/>
-              </w:rPr>
-              <w:t>r this group, we covered the Assess and Design phases of our migration framework: what exists, what depends on what, what it costs, and in what order it moves.</w:t>
+              <w:t>A cloud migration fails in planning long before it fails in cutover. For this group, we covered the Assess and Design phases of our migration framework: what exists, what depends on what, what it costs, and in what order it moves.</w:t>
             </w:r>
           </w:p>
         </w:tc>
@@ -3771,13 +3706,7 @@
         <w:rPr>
           <w:color w:val="222222"/>
         </w:rPr>
-        <w:t xml:space="preserve"> #Azure</w:t>
-      </w:r>
-      <w:r>
-        <w:rPr>
-          <w:color w:val="222222"/>
-        </w:rPr>
-        <w:t xml:space="preserve"> #AWS #</w:t>
+        <w:t xml:space="preserve"> #Azure #AWS #</w:t>
       </w:r>
       <w:proofErr w:type="spellStart"/>
       <w:r>
@@ -3807,17 +3736,7 @@
           <w:szCs w:val="30"/>
         </w:rPr>
         <w:lastRenderedPageBreak/>
-        <w:t xml:space="preserve">Post 6 · </w:t>
-      </w:r>
-      <w:r>
-        <w:rPr>
-          <w:b/>
-          <w:bCs/>
-          <w:color w:val="1F4E79"/>
-          <w:sz w:val="30"/>
-          <w:szCs w:val="30"/>
-        </w:rPr>
-        <w:t>AI agents · Carousel</w:t>
+        <w:t>Post 6 · AI agents · Carousel</w:t>
       </w:r>
     </w:p>
     <w:tbl>
@@ -4644,27 +4563,7 @@
           <w:szCs w:val="30"/>
         </w:rPr>
         <w:lastRenderedPageBreak/>
-        <w:t>Post 7</w:t>
-      </w:r>
-      <w:r>
-        <w:rPr>
-          <w:b/>
-          <w:bCs/>
-          <w:color w:val="1F4E79"/>
-          <w:sz w:val="30"/>
-          <w:szCs w:val="30"/>
-        </w:rPr>
-        <w:t xml:space="preserve"> · </w:t>
-      </w:r>
-      <w:r>
-        <w:rPr>
-          <w:b/>
-          <w:bCs/>
-          <w:color w:val="1F4E79"/>
-          <w:sz w:val="30"/>
-          <w:szCs w:val="30"/>
-        </w:rPr>
-        <w:t>Case: Azure + Databricks across the Gulf · Carousel</w:t>
+        <w:t>Post 7 · Case: Azure + Databricks across the Gulf · Carousel</w:t>
       </w:r>
     </w:p>
     <w:tbl>
@@ -5192,13 +5091,7 @@
               <w:rPr>
                 <w:color w:val="222222"/>
               </w:rPr>
-              <w:t xml:space="preserve">Different industries, different platforms, same problem: getting more out of the data they already have. Here's what we're building </w:t>
-            </w:r>
-            <w:r>
-              <w:rPr>
-                <w:color w:val="222222"/>
-              </w:rPr>
-              <w:t>with three Gulf enterprises.</w:t>
+              <w:t>Different industries, different platforms, same problem: getting more out of the data they already have. Here's what we're building with three Gulf enterprises.</w:t>
             </w:r>
           </w:p>
         </w:tc>
@@ -5284,19 +5177,7 @@
         <w:rPr>
           <w:color w:val="222222"/>
         </w:rPr>
-        <w:t>⚠</w:t>
-      </w:r>
-      <w:r>
-        <w:rPr>
-          <w:color w:val="222222"/>
-        </w:rPr>
-        <w:t>️</w:t>
-      </w:r>
-      <w:r>
-        <w:rPr>
-          <w:color w:val="222222"/>
-        </w:rPr>
-        <w:t xml:space="preserve"> </w:t>
+        <w:t xml:space="preserve">⚠️ </w:t>
       </w:r>
       <w:r>
         <w:rPr>
@@ -5310,13 +5191,7 @@
         <w:rPr>
           <w:color w:val="222222"/>
         </w:rPr>
-        <w:t xml:space="preserve"> the scope line on slides 2 to 4 (sales only gave "Azure migration" and "Da</w:t>
-      </w:r>
-      <w:r>
-        <w:rPr>
-          <w:color w:val="222222"/>
-        </w:rPr>
-        <w:t>tabricks"), whether the work is finished or still in progress, and that it's not a problem to describe these clients anonymously. If there's a measurable result (sources connected, data volume, teams using it, report time), put it on that client's slide.</w:t>
+        <w:t xml:space="preserve"> the scope line on slides 2 to 4 (sales only gave "Azure migration" and "Databricks"), whether the work is finished or still in progress, and that it's not a problem to describe these clients anonymously. If there's a measurable result (sources connected, data volume, teams using it, report time), put it on that client's slide.</w:t>
       </w:r>
     </w:p>
     <w:p>
@@ -5338,27 +5213,7 @@
           <w:szCs w:val="30"/>
         </w:rPr>
         <w:lastRenderedPageBreak/>
-        <w:t xml:space="preserve">Post 9 · </w:t>
-      </w:r>
-      <w:r>
-        <w:rPr>
-          <w:b/>
-          <w:bCs/>
-          <w:color w:val="1F4E79"/>
-          <w:sz w:val="30"/>
-          <w:szCs w:val="30"/>
-        </w:rPr>
-        <w:t xml:space="preserve">Data platforms · </w:t>
-      </w:r>
-      <w:r>
-        <w:rPr>
-          <w:b/>
-          <w:bCs/>
-          <w:color w:val="1F4E79"/>
-          <w:sz w:val="30"/>
-          <w:szCs w:val="30"/>
-        </w:rPr>
-        <w:t>Video (~25s)</w:t>
+        <w:t>Post 9 · Data platforms · Video (~25s)</w:t>
       </w:r>
     </w:p>
     <w:tbl>
@@ -5843,13 +5698,7 @@
         <w:rPr>
           <w:color w:val="222222"/>
         </w:rPr>
-        <w:t xml:space="preserve"> #Snowflake #D</w:t>
-      </w:r>
-      <w:r>
-        <w:rPr>
-          <w:color w:val="222222"/>
-        </w:rPr>
-        <w:t>atabricks #</w:t>
+        <w:t xml:space="preserve"> #Snowflake #Databricks #</w:t>
       </w:r>
       <w:proofErr w:type="spellStart"/>
       <w:r>
@@ -5945,13 +5794,7 @@
         <w:rPr>
           <w:color w:val="222222"/>
         </w:rPr>
-        <w:t>: our files say internal only, no client permission</w:t>
-      </w:r>
-      <w:r>
-        <w:rPr>
-          <w:color w:val="222222"/>
-        </w:rPr>
-        <w:t xml:space="preserve"> on record. Swap in names only once permission is confirmed</w:t>
+        <w:t>: our files say internal only, no client permission on record. Swap in names only once permission is confirmed</w:t>
       </w:r>
     </w:p>
     <w:p>
@@ -5999,13 +5842,7 @@
         <w:rPr>
           <w:color w:val="222222"/>
         </w:rPr>
-        <w:t>No headcount, country count or ISO company certi</w:t>
-      </w:r>
-      <w:r>
-        <w:rPr>
-          <w:color w:val="222222"/>
-        </w:rPr>
-        <w:t xml:space="preserve">fication. US spelling, no </w:t>
+        <w:t xml:space="preserve">No headcount, country count or ISO company certification. US spelling, no </w:t>
       </w:r>
       <w:proofErr w:type="spellStart"/>
       <w:r>

</xml_diff>